<commit_message>
add radarhoon.com to allowed hosts + nginx
</commit_message>
<xml_diff>
--- a/8XMHx3exd.docx
+++ b/8XMHx3exd.docx
@@ -6,7 +6,15 @@
       <w:r>
         <w:t>8XMHx3exd@KVUAr</w:t>
       </w:r>
+      <w:r>
+        <w:br/>
+        <w:t>secret key=</w:t>
+      </w:r>
+      <w:r>
+        <w:t>RadarHoon_Secure_Key_2026_xyz</w:t>
+      </w:r>
     </w:p>
+    <w:p/>
     <w:sectPr>
       <w:pgSz w:w="12240" w:h="15840"/>
       <w:pgMar w:top="1440" w:right="1440" w:bottom="1440" w:left="1440" w:header="708" w:footer="708" w:gutter="0"/>

</xml_diff>